<commit_message>
docs(thesis): IEEE in-text citations + reference list + strengthened research gap
- Bracketed numbered in-text citations [n] throughout the thesis body (replacing
  author-year mentions); reference list renumbered by order of first citation and
  formatted in IEEE style (18 sources, all cited).
- Added the canonical bitsandbytes references (LLM.int8 [1], QLoRA/NF4 [2]).
- Strengthened the Sec 2.4 research gap into a citation-backed, two-paragraph
  statement: three prior-work weaknesses -> the four-part design that fills them.
- docx-js validation passed; [n]->source mapping verified.

Co-Authored-By: Claude Opus 4.8 <noreply@anthropic.com>
</commit_message>
<xml_diff>
--- a/docs/FYP_Thesis_2026-06-18.docx
+++ b/docs/FYP_Thesis_2026-06-18.docx
@@ -631,7 +631,7 @@
           <w:sz w:val="24"/>
           <w:szCs w:val="24"/>
         </w:rPr>
-        <w:t xml:space="preserve">Large language models (LLMs) are increasingly deployed not in data centres but on laptops, phones, and embedded devices, where memory is scarce. The dominant enabler of this shift is quantization: representing model weights in eight, four, or fewer bits instead of sixteen, often halving or quartering the memory footprint at a small, well-studied cost to task accuracy. For compact models in the one-to-seven-billion-parameter range — the models most likely to run locally — four-bit quantization has become routine.</w:t>
+        <w:t xml:space="preserve">Large language models (LLMs) are increasingly deployed not in data centres but on laptops, phones, and embedded devices, where memory is scarce. The dominant enabler of this shift is quantization: representing model weights in eight, four, or fewer bits instead of sixteen, often halving or quartering the memory footprint at a small, well-studied cost to task accuracy [1], [2]. For compact models in the one-to-seven-billion-parameter range — the models most likely to run locally — four-bit quantization has become routine.</w:t>
       </w:r>
     </w:p>
     <w:p>
@@ -902,7 +902,7 @@
           <w:sz w:val="24"/>
           <w:szCs w:val="24"/>
         </w:rPr>
-        <w:t xml:space="preserve">Post-training quantization compresses model weights to lower-precision formats. The bitsandbytes library provides two widely used schemes evaluated here: NF4, a four-bit “normal-float” format with double quantization, and LLM.int8(), an eight-bit mixed-precision scheme that keeps outlier dimensions in higher precision. While the accuracy cost of these methods is well characterised, their effect on safety behaviour is contested. Empirical studies report mixed and method-dependent results: some find that quantization degrades safety or fairness, others find no consistent trend across bit-widths, and several emphasise that the direction depends on the method and the model (e.g. Kharinaev et al. 2025; “A Comprehensive Evaluation of Quantization Strategies for LLMs” 2024). This very inconsistency motivates a controlled, matched-pair design rather than cross-paper comparison, and it cautions against strong, uniform claims.</w:t>
+        <w:t xml:space="preserve">Post-training quantization compresses model weights to lower-precision formats. The bitsandbytes library provides two widely used schemes evaluated here: NF4, a four-bit “normal-float” format with double quantization [2], and LLM.int8(), an eight-bit mixed-precision scheme that keeps outlier dimensions in higher precision [1]. While the accuracy cost of these methods is well characterised, their effect on safety behaviour is contested. Empirical studies report mixed and method-dependent results: some find that quantization degrades safety or fairness [3], [6], others find no consistent trend across bit-widths [4], and some show that quantization can be actively exploited to surface unsafe behaviour [5]. This very inconsistency motivates a controlled, matched-pair design rather than cross-paper comparison, and it cautions against strong, uniform claims.</w:t>
       </w:r>
     </w:p>
     <w:p>
@@ -932,7 +932,7 @@
           <w:sz w:val="24"/>
           <w:szCs w:val="24"/>
         </w:rPr>
-        <w:t xml:space="preserve">HarmBench (Mazeika et al. 2024) provides a standardised red-teaming benchmark with an explicit behaviour taxonomy and, crucially, a fine-tuned classifier that scores whether a response actually exhibits the harmful behaviour — a deliberate move away from refusal-string matching. XSTest (Röttger et al. 2024) measures the opposite failure mode, over-refusal on benign prompts. Holistic frameworks such as HELM (Liang et al. 2022) formalise the idea that evaluation should be multi-metric and transparent. This thesis adopts HarmBench’s classifier-as-scorer principle as its primary instrument and treats refusal-matching only as a foil.</w:t>
+        <w:t xml:space="preserve">HarmBench [7] provides a standardised red-teaming benchmark with an explicit behaviour taxonomy and, crucially, a fine-tuned classifier that scores whether a response actually exhibits the harmful behaviour — a deliberate move away from refusal-string matching. XSTest [8] measures the opposite failure mode, over-refusal on benign prompts. Holistic frameworks such as HELM [9] formalise the idea that evaluation should be multi-metric and transparent. This thesis adopts HarmBench’s classifier-as-scorer principle [7] as its primary instrument and treats refusal-matching only as a foil.</w:t>
       </w:r>
     </w:p>
     <w:p>
@@ -962,7 +962,7 @@
           <w:sz w:val="24"/>
           <w:szCs w:val="24"/>
         </w:rPr>
-        <w:t xml:space="preserve">Using one model to judge another’s output is now common, but its validity is an active concern. Surveys of LLM-as-judge methods (e.g. Gu et al. 2024) and critical studies (“No Free Labels: Limitations of LLM-as-a-Judge Without Human Grounding” 2025) recommend reporting chance-corrected agreement (Cohen’s κ) rather than raw accuracy, using more than one judge, and acknowledging that without human grounding a judge can be systematically biased. This thesis follows that guidance — a primary classifier, a second independent judge, κ reporting, and bootstrap confidence intervals — and is explicit about the one safeguard it does not have (human-label validation).</w:t>
+        <w:t xml:space="preserve">Using one model to judge another’s output is now common, but its validity is an active concern. Surveys of LLM-as-judge methods [10] and critical studies [11] recommend reporting chance-corrected agreement (Cohen’s κ) rather than raw accuracy, using more than one judge, and acknowledging that without human grounding a judge can be systematically biased [11]. This thesis follows that guidance — a primary classifier, a second independent judge, κ reporting, and bootstrap confidence intervals — and is explicit about the one safeguard it does not have (human-label validation).</w:t>
       </w:r>
     </w:p>
     <w:p>
@@ -992,7 +992,21 @@
           <w:sz w:val="24"/>
           <w:szCs w:val="24"/>
         </w:rPr>
-        <w:t xml:space="preserve">Existing work evaluates either full-precision models, or quantized models without controlling for confounds and scoring validity, or quantization accuracy without safety. No prior study, to the author’s knowledge, combines a matched-pair design, a judge-validated primary scorer with an independent cross-check, a capability anchor to separate alignment from capability, and a multi-precision sweep, on compact models across families. That combination is the gap this thesis fills.</w:t>
+        <w:t xml:space="preserve">Three observations define the gap this thesis addresses. First, the quantization–safety literature reports inconsistent, method- and model-dependent effects [3]–[6], so cross-paper comparison cannot settle whether quantization shifts safety; a controlled, matched-pair design that isolates quantization is required. Second, harmful compliance is frequently scored by refusal-matching rather than by a validated classifier, so a reported “attack success” may be a scoring artefact, and where LLM judges are used their inter-judge agreement is often left unreported [10], [11] — yet the benchmark’s own fine-tuned classifier exists precisely to avoid this [7]. Third, studies that do measure quantization rarely separate a safety change from a capability change, and almost none trace the effect across more than one precision or quantization method.</w:t>
+      </w:r>
+    </w:p>
+    <w:p>
+      <w:pPr>
+        <w:spacing w:after="160" w:line="276"/>
+        <w:jc w:val="both"/>
+      </w:pPr>
+      <w:r>
+        <w:rPr>
+          <w:rFonts w:ascii="Times New Roman" w:cs="Times New Roman" w:eastAsia="Times New Roman" w:hAnsi="Times New Roman"/>
+          <w:sz w:val="24"/>
+          <w:szCs w:val="24"/>
+        </w:rPr>
+        <w:t xml:space="preserve">No prior study, to the author’s knowledge, combines all four of the following on compact models across several families: (i) a matched-pair design that isolates quantization as the sole variable; (ii) a judge-validated primary scorer with an independent second judge and reported chance-corrected agreement; (iii) a capability anchor that separates alignment shifts from capability degradation; and (iv) a multi-precision sweep (fp16 → INT8 → NF4) that tests whether any effect is graded with bit-width or specific to a method. That combination is the gap this thesis fills, and each component directly answers one of the weaknesses identified above.</w:t>
       </w:r>
     </w:p>
     <w:p>
@@ -1823,7 +1837,7 @@
           <w:sz w:val="24"/>
           <w:szCs w:val="24"/>
         </w:rPr>
-        <w:t xml:space="preserve">Four benchmarks span the two axes of interest. Harmful compliance and over-refusal capture safety; MMLU and ARC-Challenge capture capability, with two independent benchmarks so that capability claims do not rest on a single test.</w:t>
+        <w:t xml:space="preserve">Four benchmarks span the two axes of interest. Harmful compliance (HarmBench [7]) and over-refusal (XSTest [8]) capture safety; MMLU [12] and ARC-Challenge [13] capture capability, using two independent benchmarks so that capability claims do not rest on a single test.</w:t>
       </w:r>
     </w:p>
     <w:tbl>
@@ -2453,7 +2467,7 @@
           <w:sz w:val="24"/>
           <w:szCs w:val="24"/>
         </w:rPr>
-        <w:t xml:space="preserve">HarmBench Attack Success Rate is scored by the official HarmBench classifier (cais/HarmBench-Llama-2-13b-cls), run in full precision so that the reference instrument is not itself confounded by quantization. A second, architecturally independent judge (GPT-4o) re-scores the same generations as a robustness check. A deterministic refusal regex is retained only as a secondary, transparent proxy. This choice is itself a research object: the thesis reports the agreement between scorers and shows that the regex over-counts, which is why it is demoted. MMLU and ARC use deterministic exact match; XSTest over-refusal uses the regex (the HarmBench classifier judges harmful compliance only).</w:t>
+        <w:t xml:space="preserve">HarmBench Attack Success Rate is scored by the official HarmBench classifier (cais/HarmBench-Llama-2-13b-cls) [7], run in full precision so that the reference instrument is not itself confounded by quantization. A second, architecturally independent judge (GPT-4o) re-scores the same generations as a robustness check [10], [11]. A deterministic refusal regex is retained only as a secondary, transparent proxy. This choice is itself a research object: the thesis reports the agreement between scorers and shows that the regex over-counts, which is why it is demoted. MMLU and ARC use deterministic exact match; XSTest over-refusal uses the regex (the HarmBench classifier judges harmful compliance only).</w:t>
       </w:r>
     </w:p>
     <w:p>
@@ -5385,7 +5399,7 @@
           <w:sz w:val="24"/>
           <w:szCs w:val="24"/>
         </w:rPr>
-        <w:t xml:space="preserve">To probe why the smallest model moves, a derived analysis measured each model’s first-token refusal margin in fp16 and under NF4. A thin baseline margin does predict which prompts flip, but only weakly within a family, and the flips are symmetric — quantization destabilises the decision boundary in both directions rather than eroding refusals one-directionally. For the one moving pair, the change is more consistent with generic capability-driven boundary instability than a targeted alignment shift, reinforcing the capability-anchored reading.</w:t>
+        <w:t xml:space="preserve">To probe why the smallest model moves, a derived analysis measured each model’s first-token refusal margin in fp16 and under NF4, following the observation that quantization most affects low-confidence, near-boundary decisions [14]. A thin baseline margin does predict which prompts flip, but only weakly within a family, and the flips are symmetric — quantization destabilises the decision boundary in both directions rather than eroding refusals one-directionally. For the one moving pair, the change is more consistent with generic capability-driven boundary instability than a targeted alignment shift, reinforcing the capability-anchored reading.</w:t>
       </w:r>
     </w:p>
     <w:p>
@@ -6773,290 +6787,254 @@
     </w:p>
     <w:p>
       <w:pPr>
-        <w:pStyle w:val="ListParagraph"/>
-        <w:numPr>
-          <w:ilvl w:val="0"/>
-          <w:numId w:val="5"/>
-        </w:numPr>
-        <w:spacing w:after="80" w:line="276"/>
-      </w:pPr>
-      <w:r>
-        <w:rPr>
-          <w:rFonts w:ascii="Times New Roman" w:cs="Times New Roman" w:eastAsia="Times New Roman" w:hAnsi="Times New Roman"/>
-          <w:sz w:val="24"/>
-          <w:szCs w:val="24"/>
-        </w:rPr>
-        <w:t xml:space="preserve">Liang, P. et al. (2022). Holistic Evaluation of Language Models. arXiv:2211.09110 (TMLR 2023).</w:t>
-      </w:r>
-    </w:p>
-    <w:p>
-      <w:pPr>
-        <w:pStyle w:val="ListParagraph"/>
-        <w:numPr>
-          <w:ilvl w:val="0"/>
-          <w:numId w:val="5"/>
-        </w:numPr>
-        <w:spacing w:after="80" w:line="276"/>
-      </w:pPr>
-      <w:r>
-        <w:rPr>
-          <w:rFonts w:ascii="Times New Roman" w:cs="Times New Roman" w:eastAsia="Times New Roman" w:hAnsi="Times New Roman"/>
-          <w:sz w:val="24"/>
-          <w:szCs w:val="24"/>
-        </w:rPr>
-        <w:t xml:space="preserve">Mazeika, M. et al. (2024). HarmBench: A Standardized Evaluation Framework for Automated Red Teaming and Robust Refusal. ICML 2024. arXiv:2402.04249.</w:t>
-      </w:r>
-    </w:p>
-    <w:p>
-      <w:pPr>
-        <w:pStyle w:val="ListParagraph"/>
-        <w:numPr>
-          <w:ilvl w:val="0"/>
-          <w:numId w:val="5"/>
-        </w:numPr>
-        <w:spacing w:after="80" w:line="276"/>
-      </w:pPr>
-      <w:r>
-        <w:rPr>
-          <w:rFonts w:ascii="Times New Roman" w:cs="Times New Roman" w:eastAsia="Times New Roman" w:hAnsi="Times New Roman"/>
-          <w:sz w:val="24"/>
-          <w:szCs w:val="24"/>
-        </w:rPr>
-        <w:t xml:space="preserve">Röttger, P. et al. (2024). XSTest: A Test Suite for Identifying Exaggerated Safety Behaviours in Large Language Models. NAACL 2024.</w:t>
-      </w:r>
-    </w:p>
-    <w:p>
-      <w:pPr>
-        <w:pStyle w:val="ListParagraph"/>
-        <w:numPr>
-          <w:ilvl w:val="0"/>
-          <w:numId w:val="5"/>
-        </w:numPr>
-        <w:spacing w:after="80" w:line="276"/>
-      </w:pPr>
-      <w:r>
-        <w:rPr>
-          <w:rFonts w:ascii="Times New Roman" w:cs="Times New Roman" w:eastAsia="Times New Roman" w:hAnsi="Times New Roman"/>
-          <w:sz w:val="24"/>
-          <w:szCs w:val="24"/>
-        </w:rPr>
-        <w:t xml:space="preserve">Hendrycks, D. et al. (2021). Measuring Massive Multitask Language Understanding (MMLU). ICLR 2021.</w:t>
-      </w:r>
-    </w:p>
-    <w:p>
-      <w:pPr>
-        <w:pStyle w:val="ListParagraph"/>
-        <w:numPr>
-          <w:ilvl w:val="0"/>
-          <w:numId w:val="5"/>
-        </w:numPr>
-        <w:spacing w:after="80" w:line="276"/>
-      </w:pPr>
-      <w:r>
-        <w:rPr>
-          <w:rFonts w:ascii="Times New Roman" w:cs="Times New Roman" w:eastAsia="Times New Roman" w:hAnsi="Times New Roman"/>
-          <w:sz w:val="24"/>
-          <w:szCs w:val="24"/>
-        </w:rPr>
-        <w:t xml:space="preserve">Clark, P. et al. (2018). Think You Have Solved Question Answering? Try ARC, the AI2 Reasoning Challenge. arXiv:1803.05457.</w:t>
-      </w:r>
-    </w:p>
-    <w:p>
-      <w:pPr>
-        <w:pStyle w:val="ListParagraph"/>
-        <w:numPr>
-          <w:ilvl w:val="0"/>
-          <w:numId w:val="5"/>
-        </w:numPr>
-        <w:spacing w:after="80" w:line="276"/>
-      </w:pPr>
-      <w:r>
-        <w:rPr>
-          <w:rFonts w:ascii="Times New Roman" w:cs="Times New Roman" w:eastAsia="Times New Roman" w:hAnsi="Times New Roman"/>
-          <w:sz w:val="24"/>
-          <w:szCs w:val="24"/>
-        </w:rPr>
-        <w:t xml:space="preserve">Kharinaev, A. et al. (2025). Investigating the Impact of Quantization Methods on the Safety and Reliability of Large Language Models. arXiv:2502.15799.</w:t>
-      </w:r>
-    </w:p>
-    <w:p>
-      <w:pPr>
-        <w:pStyle w:val="ListParagraph"/>
-        <w:numPr>
-          <w:ilvl w:val="0"/>
-          <w:numId w:val="5"/>
-        </w:numPr>
-        <w:spacing w:after="80" w:line="276"/>
-      </w:pPr>
-      <w:r>
-        <w:rPr>
-          <w:rFonts w:ascii="Times New Roman" w:cs="Times New Roman" w:eastAsia="Times New Roman" w:hAnsi="Times New Roman"/>
-          <w:sz w:val="24"/>
-          <w:szCs w:val="24"/>
-        </w:rPr>
-        <w:t xml:space="preserve">Jin, R. et al. (2024). A Comprehensive Evaluation of Quantization Strategies for Large Language Models. arXiv:2402.16775.</w:t>
-      </w:r>
-    </w:p>
-    <w:p>
-      <w:pPr>
-        <w:pStyle w:val="ListParagraph"/>
-        <w:numPr>
-          <w:ilvl w:val="0"/>
-          <w:numId w:val="5"/>
-        </w:numPr>
-        <w:spacing w:after="80" w:line="276"/>
-      </w:pPr>
-      <w:r>
-        <w:rPr>
-          <w:rFonts w:ascii="Times New Roman" w:cs="Times New Roman" w:eastAsia="Times New Roman" w:hAnsi="Times New Roman"/>
-          <w:sz w:val="24"/>
-          <w:szCs w:val="24"/>
-        </w:rPr>
-        <w:t xml:space="preserve">Proskurina, I. et al. (2024). When Quantization Affects Confidence of Large Language Models? arXiv:2405.00632.</w:t>
-      </w:r>
-    </w:p>
-    <w:p>
-      <w:pPr>
-        <w:pStyle w:val="ListParagraph"/>
-        <w:numPr>
-          <w:ilvl w:val="0"/>
-          <w:numId w:val="5"/>
-        </w:numPr>
-        <w:spacing w:after="80" w:line="276"/>
-      </w:pPr>
-      <w:r>
-        <w:rPr>
-          <w:rFonts w:ascii="Times New Roman" w:cs="Times New Roman" w:eastAsia="Times New Roman" w:hAnsi="Times New Roman"/>
-          <w:sz w:val="24"/>
-          <w:szCs w:val="24"/>
-        </w:rPr>
-        <w:t xml:space="preserve">Egashira, K. et al. (2024). Exploiting LLM Quantization. arXiv:2405.18137.</w:t>
-      </w:r>
-    </w:p>
-    <w:p>
-      <w:pPr>
-        <w:pStyle w:val="ListParagraph"/>
-        <w:numPr>
-          <w:ilvl w:val="0"/>
-          <w:numId w:val="5"/>
-        </w:numPr>
-        <w:spacing w:after="80" w:line="276"/>
-      </w:pPr>
-      <w:r>
-        <w:rPr>
-          <w:rFonts w:ascii="Times New Roman" w:cs="Times New Roman" w:eastAsia="Times New Roman" w:hAnsi="Times New Roman"/>
-          <w:sz w:val="24"/>
-          <w:szCs w:val="24"/>
-        </w:rPr>
-        <w:t xml:space="preserve">Belkhiter, Y. et al. (2024). HarmLevelBench: Evaluating Harm-Level Compliance and the Impact of Quantization. arXiv:2411.06835.</w:t>
-      </w:r>
-    </w:p>
-    <w:p>
-      <w:pPr>
-        <w:pStyle w:val="ListParagraph"/>
-        <w:numPr>
-          <w:ilvl w:val="0"/>
-          <w:numId w:val="5"/>
-        </w:numPr>
-        <w:spacing w:after="80" w:line="276"/>
-      </w:pPr>
-      <w:r>
-        <w:rPr>
-          <w:rFonts w:ascii="Times New Roman" w:cs="Times New Roman" w:eastAsia="Times New Roman" w:hAnsi="Times New Roman"/>
-          <w:sz w:val="24"/>
-          <w:szCs w:val="24"/>
-        </w:rPr>
-        <w:t xml:space="preserve">Gu, J. et al. (2024). A Survey on LLM-as-a-Judge. arXiv:2411.15594.</w:t>
-      </w:r>
-    </w:p>
-    <w:p>
-      <w:pPr>
-        <w:pStyle w:val="ListParagraph"/>
-        <w:numPr>
-          <w:ilvl w:val="0"/>
-          <w:numId w:val="5"/>
-        </w:numPr>
-        <w:spacing w:after="80" w:line="276"/>
-      </w:pPr>
-      <w:r>
-        <w:rPr>
-          <w:rFonts w:ascii="Times New Roman" w:cs="Times New Roman" w:eastAsia="Times New Roman" w:hAnsi="Times New Roman"/>
-          <w:sz w:val="24"/>
-          <w:szCs w:val="24"/>
-        </w:rPr>
-        <w:t xml:space="preserve">Anonymous (2025). No Free Labels: Limitations of LLM-as-a-Judge Without Human Grounding. arXiv:2503.05061.</w:t>
-      </w:r>
-    </w:p>
-    <w:p>
-      <w:pPr>
-        <w:pStyle w:val="ListParagraph"/>
-        <w:numPr>
-          <w:ilvl w:val="0"/>
-          <w:numId w:val="5"/>
-        </w:numPr>
-        <w:spacing w:after="80" w:line="276"/>
-      </w:pPr>
-      <w:r>
-        <w:rPr>
-          <w:rFonts w:ascii="Times New Roman" w:cs="Times New Roman" w:eastAsia="Times New Roman" w:hAnsi="Times New Roman"/>
-          <w:sz w:val="24"/>
-          <w:szCs w:val="24"/>
-        </w:rPr>
-        <w:t xml:space="preserve">Pineau, J. et al. (2021). Improving Reproducibility in Machine Learning Research (a report from the NeurIPS 2019 Reproducibility Program). JMLR 22.</w:t>
-      </w:r>
-    </w:p>
-    <w:p>
-      <w:pPr>
-        <w:pStyle w:val="ListParagraph"/>
-        <w:numPr>
-          <w:ilvl w:val="0"/>
-          <w:numId w:val="5"/>
-        </w:numPr>
-        <w:spacing w:after="80" w:line="276"/>
-      </w:pPr>
-      <w:r>
-        <w:rPr>
-          <w:rFonts w:ascii="Times New Roman" w:cs="Times New Roman" w:eastAsia="Times New Roman" w:hAnsi="Times New Roman"/>
-          <w:sz w:val="24"/>
-          <w:szCs w:val="24"/>
-        </w:rPr>
-        <w:t xml:space="preserve">Sandve, G. K. et al. (2013). Ten Simple Rules for Reproducible Computational Research. PLOS Computational Biology 9(10): e1003285.</w:t>
-      </w:r>
-    </w:p>
-    <w:p>
-      <w:pPr>
-        <w:pStyle w:val="ListParagraph"/>
-        <w:numPr>
-          <w:ilvl w:val="0"/>
-          <w:numId w:val="5"/>
-        </w:numPr>
-        <w:spacing w:after="80" w:line="276"/>
-      </w:pPr>
-      <w:r>
-        <w:rPr>
-          <w:rFonts w:ascii="Times New Roman" w:cs="Times New Roman" w:eastAsia="Times New Roman" w:hAnsi="Times New Roman"/>
-          <w:sz w:val="24"/>
-          <w:szCs w:val="24"/>
-        </w:rPr>
-        <w:t xml:space="preserve">Wilson, G. et al. (2017). Good Enough Practices in Scientific Computing. PLOS Computational Biology 13(6): e1005510.</w:t>
-      </w:r>
-    </w:p>
-    <w:p>
-      <w:pPr>
-        <w:pStyle w:val="ListParagraph"/>
-        <w:numPr>
-          <w:ilvl w:val="0"/>
-          <w:numId w:val="5"/>
-        </w:numPr>
-        <w:spacing w:after="80" w:line="276"/>
-      </w:pPr>
-      <w:r>
-        <w:rPr>
-          <w:rFonts w:ascii="Times New Roman" w:cs="Times New Roman" w:eastAsia="Times New Roman" w:hAnsi="Times New Roman"/>
-          <w:sz w:val="24"/>
-          <w:szCs w:val="24"/>
-        </w:rPr>
-        <w:t xml:space="preserve">Smith, A. M. et al. (2018). Journal of Open Source Software (JOSS): Design and First-Year Review. arXiv:1707.02264.</w:t>
+        <w:spacing w:after="90" w:line="264"/>
+        <w:ind w:left="400" w:hanging="400"/>
+      </w:pPr>
+      <w:r>
+        <w:rPr>
+          <w:rFonts w:ascii="Times New Roman" w:cs="Times New Roman" w:eastAsia="Times New Roman" w:hAnsi="Times New Roman"/>
+          <w:sz w:val="22"/>
+          <w:szCs w:val="22"/>
+        </w:rPr>
+        <w:t xml:space="preserve">[1] T. Dettmers, M. Lewis, Y. Belkada, and L. Zettlemoyer, “LLM.int8(): 8-bit matrix multiplication for transformers at scale,” in Proc. Advances in Neural Information Processing Systems (NeurIPS), 2022. arXiv:2208.07339.</w:t>
+      </w:r>
+    </w:p>
+    <w:p>
+      <w:pPr>
+        <w:spacing w:after="90" w:line="264"/>
+        <w:ind w:left="400" w:hanging="400"/>
+      </w:pPr>
+      <w:r>
+        <w:rPr>
+          <w:rFonts w:ascii="Times New Roman" w:cs="Times New Roman" w:eastAsia="Times New Roman" w:hAnsi="Times New Roman"/>
+          <w:sz w:val="22"/>
+          <w:szCs w:val="22"/>
+        </w:rPr>
+        <w:t xml:space="preserve">[2] T. Dettmers, A. Pagnoni, A. Holtzman, and L. Zettlemoyer, “QLoRA: Efficient finetuning of quantized LLMs,” in Proc. NeurIPS, 2023. arXiv:2305.14314.</w:t>
+      </w:r>
+    </w:p>
+    <w:p>
+      <w:pPr>
+        <w:spacing w:after="90" w:line="264"/>
+        <w:ind w:left="400" w:hanging="400"/>
+      </w:pPr>
+      <w:r>
+        <w:rPr>
+          <w:rFonts w:ascii="Times New Roman" w:cs="Times New Roman" w:eastAsia="Times New Roman" w:hAnsi="Times New Roman"/>
+          <w:sz w:val="22"/>
+          <w:szCs w:val="22"/>
+        </w:rPr>
+        <w:t xml:space="preserve">[3] A. Kharinaev et al., “Investigating the impact of quantization methods on the safety and reliability of large language models,” arXiv preprint arXiv:2502.15799, 2025.</w:t>
+      </w:r>
+    </w:p>
+    <w:p>
+      <w:pPr>
+        <w:spacing w:after="90" w:line="264"/>
+        <w:ind w:left="400" w:hanging="400"/>
+      </w:pPr>
+      <w:r>
+        <w:rPr>
+          <w:rFonts w:ascii="Times New Roman" w:cs="Times New Roman" w:eastAsia="Times New Roman" w:hAnsi="Times New Roman"/>
+          <w:sz w:val="22"/>
+          <w:szCs w:val="22"/>
+        </w:rPr>
+        <w:t xml:space="preserve">[4] R. Jin et al., “A comprehensive evaluation of quantization strategies for large language models,” arXiv preprint arXiv:2402.16775, 2024.</w:t>
+      </w:r>
+    </w:p>
+    <w:p>
+      <w:pPr>
+        <w:spacing w:after="90" w:line="264"/>
+        <w:ind w:left="400" w:hanging="400"/>
+      </w:pPr>
+      <w:r>
+        <w:rPr>
+          <w:rFonts w:ascii="Times New Roman" w:cs="Times New Roman" w:eastAsia="Times New Roman" w:hAnsi="Times New Roman"/>
+          <w:sz w:val="22"/>
+          <w:szCs w:val="22"/>
+        </w:rPr>
+        <w:t xml:space="preserve">[5] K. Egashira et al., “Exploiting LLM quantization,” in Proc. NeurIPS, 2024. arXiv:2405.18137.</w:t>
+      </w:r>
+    </w:p>
+    <w:p>
+      <w:pPr>
+        <w:spacing w:after="90" w:line="264"/>
+        <w:ind w:left="400" w:hanging="400"/>
+      </w:pPr>
+      <w:r>
+        <w:rPr>
+          <w:rFonts w:ascii="Times New Roman" w:cs="Times New Roman" w:eastAsia="Times New Roman" w:hAnsi="Times New Roman"/>
+          <w:sz w:val="22"/>
+          <w:szCs w:val="22"/>
+        </w:rPr>
+        <w:t xml:space="preserve">[6] Y. Belkhiter et al., “HarmLevelBench: Evaluating harm-level compliance and the impact of quantization on model alignment,” arXiv preprint arXiv:2411.06835, 2024.</w:t>
+      </w:r>
+    </w:p>
+    <w:p>
+      <w:pPr>
+        <w:spacing w:after="90" w:line="264"/>
+        <w:ind w:left="400" w:hanging="400"/>
+      </w:pPr>
+      <w:r>
+        <w:rPr>
+          <w:rFonts w:ascii="Times New Roman" w:cs="Times New Roman" w:eastAsia="Times New Roman" w:hAnsi="Times New Roman"/>
+          <w:sz w:val="22"/>
+          <w:szCs w:val="22"/>
+        </w:rPr>
+        <w:t xml:space="preserve">[7] M. Mazeika et al., “HarmBench: A standardized evaluation framework for automated red teaming and robust refusal,” in Proc. International Conference on Machine Learning (ICML), 2024. arXiv:2402.04249.</w:t>
+      </w:r>
+    </w:p>
+    <w:p>
+      <w:pPr>
+        <w:spacing w:after="90" w:line="264"/>
+        <w:ind w:left="400" w:hanging="400"/>
+      </w:pPr>
+      <w:r>
+        <w:rPr>
+          <w:rFonts w:ascii="Times New Roman" w:cs="Times New Roman" w:eastAsia="Times New Roman" w:hAnsi="Times New Roman"/>
+          <w:sz w:val="22"/>
+          <w:szCs w:val="22"/>
+        </w:rPr>
+        <w:t xml:space="preserve">[8] P. Röttger, H. R. Kirk, B. Vidgen, G. Attanasio, F. Bianchi, and D. Hovy, “XSTest: A test suite for identifying exaggerated safety behaviours in large language models,” in Proc. NAACL, 2024. arXiv:2308.01263.</w:t>
+      </w:r>
+    </w:p>
+    <w:p>
+      <w:pPr>
+        <w:spacing w:after="90" w:line="264"/>
+        <w:ind w:left="400" w:hanging="400"/>
+      </w:pPr>
+      <w:r>
+        <w:rPr>
+          <w:rFonts w:ascii="Times New Roman" w:cs="Times New Roman" w:eastAsia="Times New Roman" w:hAnsi="Times New Roman"/>
+          <w:sz w:val="22"/>
+          <w:szCs w:val="22"/>
+        </w:rPr>
+        <w:t xml:space="preserve">[9] P. Liang et al., “Holistic evaluation of language models,” Transactions on Machine Learning Research (TMLR), 2023. arXiv:2211.09110.</w:t>
+      </w:r>
+    </w:p>
+    <w:p>
+      <w:pPr>
+        <w:spacing w:after="90" w:line="264"/>
+        <w:ind w:left="400" w:hanging="400"/>
+      </w:pPr>
+      <w:r>
+        <w:rPr>
+          <w:rFonts w:ascii="Times New Roman" w:cs="Times New Roman" w:eastAsia="Times New Roman" w:hAnsi="Times New Roman"/>
+          <w:sz w:val="22"/>
+          <w:szCs w:val="22"/>
+        </w:rPr>
+        <w:t xml:space="preserve">[10] J. Gu et al., “A survey on LLM-as-a-judge,” arXiv preprint arXiv:2411.15594, 2024.</w:t>
+      </w:r>
+    </w:p>
+    <w:p>
+      <w:pPr>
+        <w:spacing w:after="90" w:line="264"/>
+        <w:ind w:left="400" w:hanging="400"/>
+      </w:pPr>
+      <w:r>
+        <w:rPr>
+          <w:rFonts w:ascii="Times New Roman" w:cs="Times New Roman" w:eastAsia="Times New Roman" w:hAnsi="Times New Roman"/>
+          <w:sz w:val="22"/>
+          <w:szCs w:val="22"/>
+        </w:rPr>
+        <w:t xml:space="preserve">[11] M. Krumdick et al., “No free labels: Limitations of LLM-as-a-judge without human grounding,” arXiv preprint arXiv:2503.05061, 2025.</w:t>
+      </w:r>
+    </w:p>
+    <w:p>
+      <w:pPr>
+        <w:spacing w:after="90" w:line="264"/>
+        <w:ind w:left="400" w:hanging="400"/>
+      </w:pPr>
+      <w:r>
+        <w:rPr>
+          <w:rFonts w:ascii="Times New Roman" w:cs="Times New Roman" w:eastAsia="Times New Roman" w:hAnsi="Times New Roman"/>
+          <w:sz w:val="22"/>
+          <w:szCs w:val="22"/>
+        </w:rPr>
+        <w:t xml:space="preserve">[12] D. Hendrycks, C. Burns, S. Basart, A. Zou, M. Mazeika, D. Song, and J. Steinhardt, “Measuring massive multitask language understanding,” in Proc. International Conference on Learning Representations (ICLR), 2021. arXiv:2009.03300.</w:t>
+      </w:r>
+    </w:p>
+    <w:p>
+      <w:pPr>
+        <w:spacing w:after="90" w:line="264"/>
+        <w:ind w:left="400" w:hanging="400"/>
+      </w:pPr>
+      <w:r>
+        <w:rPr>
+          <w:rFonts w:ascii="Times New Roman" w:cs="Times New Roman" w:eastAsia="Times New Roman" w:hAnsi="Times New Roman"/>
+          <w:sz w:val="22"/>
+          <w:szCs w:val="22"/>
+        </w:rPr>
+        <w:t xml:space="preserve">[13] P. Clark, I. Cowhey, O. Etzioni, T. Khot, A. Sabharwal, C. Schoenick, and O. Tafjord, “Think you have solved question answering? Try ARC, the AI2 reasoning challenge,” arXiv preprint arXiv:1803.05457, 2018.</w:t>
+      </w:r>
+    </w:p>
+    <w:p>
+      <w:pPr>
+        <w:spacing w:after="90" w:line="264"/>
+        <w:ind w:left="400" w:hanging="400"/>
+      </w:pPr>
+      <w:r>
+        <w:rPr>
+          <w:rFonts w:ascii="Times New Roman" w:cs="Times New Roman" w:eastAsia="Times New Roman" w:hAnsi="Times New Roman"/>
+          <w:sz w:val="22"/>
+          <w:szCs w:val="22"/>
+        </w:rPr>
+        <w:t xml:space="preserve">[14] I. Proskurina, L. Brun, G. Metzler, and J. Velcin, “When quantization affects confidence of large language models?,” in Findings of NAACL, 2024. arXiv:2405.00632.</w:t>
+      </w:r>
+    </w:p>
+    <w:p>
+      <w:pPr>
+        <w:spacing w:after="90" w:line="264"/>
+        <w:ind w:left="400" w:hanging="400"/>
+      </w:pPr>
+      <w:r>
+        <w:rPr>
+          <w:rFonts w:ascii="Times New Roman" w:cs="Times New Roman" w:eastAsia="Times New Roman" w:hAnsi="Times New Roman"/>
+          <w:sz w:val="22"/>
+          <w:szCs w:val="22"/>
+        </w:rPr>
+        <w:t xml:space="preserve">[15] J. Pineau et al., “Improving reproducibility in machine learning research (a report from the NeurIPS 2019 reproducibility program),” Journal of Machine Learning Research (JMLR), vol. 22, pp. 1–20, 2021.</w:t>
+      </w:r>
+    </w:p>
+    <w:p>
+      <w:pPr>
+        <w:spacing w:after="90" w:line="264"/>
+        <w:ind w:left="400" w:hanging="400"/>
+      </w:pPr>
+      <w:r>
+        <w:rPr>
+          <w:rFonts w:ascii="Times New Roman" w:cs="Times New Roman" w:eastAsia="Times New Roman" w:hAnsi="Times New Roman"/>
+          <w:sz w:val="22"/>
+          <w:szCs w:val="22"/>
+        </w:rPr>
+        <w:t xml:space="preserve">[16] G. K. Sandve, A. Nekrutenko, J. Taylor, and E. Hovig, “Ten simple rules for reproducible computational research,” PLOS Computational Biology, vol. 9, no. 10, e1003285, 2013.</w:t>
+      </w:r>
+    </w:p>
+    <w:p>
+      <w:pPr>
+        <w:spacing w:after="90" w:line="264"/>
+        <w:ind w:left="400" w:hanging="400"/>
+      </w:pPr>
+      <w:r>
+        <w:rPr>
+          <w:rFonts w:ascii="Times New Roman" w:cs="Times New Roman" w:eastAsia="Times New Roman" w:hAnsi="Times New Roman"/>
+          <w:sz w:val="22"/>
+          <w:szCs w:val="22"/>
+        </w:rPr>
+        <w:t xml:space="preserve">[17] G. Wilson, J. Bryan, K. Cranston, J. Kitzes, L. Nederbragt, and T. K. Teal, “Good enough practices in scientific computing,” PLOS Computational Biology, vol. 13, no. 6, e1005510, 2017.</w:t>
+      </w:r>
+    </w:p>
+    <w:p>
+      <w:pPr>
+        <w:spacing w:after="90" w:line="264"/>
+        <w:ind w:left="400" w:hanging="400"/>
+      </w:pPr>
+      <w:r>
+        <w:rPr>
+          <w:rFonts w:ascii="Times New Roman" w:cs="Times New Roman" w:eastAsia="Times New Roman" w:hAnsi="Times New Roman"/>
+          <w:sz w:val="22"/>
+          <w:szCs w:val="22"/>
+        </w:rPr>
+        <w:t xml:space="preserve">[18] A. M. Smith et al., “Journal of Open Source Software (JOSS): Design and first-year review,” arXiv preprint arXiv:1707.02264, 2018.</w:t>
       </w:r>
     </w:p>
     <w:p>
@@ -7087,7 +7065,7 @@
           <w:sz w:val="24"/>
           <w:szCs w:val="24"/>
         </w:rPr>
-        <w:t xml:space="preserve">All code, configuration, and redacted result artefacts are in the project repository. The analysis reproduces byte-for-byte from the committed sidecars without a GPU; full experiments require the gated model weights and a CUDA GPU. The project maps to the ML Reproducibility Checklist (Pineau et al. 2021): models and algorithms are described (Chapters 3–4); datasets, splits, and sample counts are recorded in each run summary; code and pinned dependencies are released; hyper-parameters and decoding controls are recorded in every summary; the compute infrastructure is recorded; and significance procedures are specified, with multiple comparisons disclosed. Raw generations are gitignored and hash-pinned; only redacted sidecars (identifiers, booleans, scalars) are released, so the study is reproducible without redistributing harmful text.</w:t>
+        <w:t xml:space="preserve">All code, configuration, and redacted result artefacts are in the project repository. The analysis reproduces byte-for-byte from the committed sidecars without a GPU; full experiments require the gated model weights and a CUDA GPU. The project maps to the ML Reproducibility Checklist [15]: models and algorithms are described (Chapters 3–4); datasets, splits, and sample counts are recorded in each run summary; code and pinned dependencies are released; hyper-parameters and decoding controls are recorded in every summary; the compute infrastructure is recorded; and significance procedures are specified, with multiple comparisons disclosed. The repository follows recognised research-software practice — scripts rather than manual steps, fixed seeds, explicit dependencies, and a documented project structure [16], [17] — and is packaged for reuse in line with open-source-software peer-review norms [18]. Raw generations are gitignored and hash-pinned; only redacted sidecars (identifiers, booleans, scalars) are released, so the study is reproducible without redistributing harmful text.</w:t>
       </w:r>
     </w:p>
     <w:p>
@@ -7435,12 +7413,6 @@
   </w:num>
   <w:num w:numId="4">
     <w:abstractNumId w:val="4"/>
-    <w:lvlOverride w:ilvl="0">
-      <w:startOverride w:val="1"/>
-    </w:lvlOverride>
-  </w:num>
-  <w:num w:numId="5">
-    <w:abstractNumId w:val="5"/>
     <w:lvlOverride w:ilvl="0">
       <w:startOverride w:val="1"/>
     </w:lvlOverride>

</xml_diff>

<commit_message>
docs(thesis): verify every reference against arXiv; fix 5 venue/year precision errors
Browsed and verified all 18 sources against their arXiv abstract pages (title,
first author, ID). All are real and correctly attributed — none hallucinated.
Corrected precision issues found during verification:
- [4] Jin: add verified venue (ACL Findings 2024)
- [5] Egashira: drop unconfirmed NeurIPS venue -> arXiv preprint form
- [14] Proskurina: drop unconfirmed NAACL Findings venue -> arXiv preprint form
- [15] Pineau: add arXiv:2003.12206
- [18] JOSS: year 2018 -> 2017 (matches arXiv)

Co-Authored-By: Claude Opus 4.8 <noreply@anthropic.com>
</commit_message>
<xml_diff>
--- a/docs/FYP_Thesis_2026-06-18.docx
+++ b/docs/FYP_Thesis_2026-06-18.docx
@@ -6838,7 +6838,7 @@
           <w:sz w:val="22"/>
           <w:szCs w:val="22"/>
         </w:rPr>
-        <w:t xml:space="preserve">[4] R. Jin et al., “A comprehensive evaluation of quantization strategies for large language models,” arXiv preprint arXiv:2402.16775, 2024.</w:t>
+        <w:t xml:space="preserve">[4] R. Jin et al., “A comprehensive evaluation of quantization strategies for large language models,” in Findings of the Association for Computational Linguistics (ACL Findings), 2024. arXiv:2402.16775.</w:t>
       </w:r>
     </w:p>
     <w:p>
@@ -6852,7 +6852,7 @@
           <w:sz w:val="22"/>
           <w:szCs w:val="22"/>
         </w:rPr>
-        <w:t xml:space="preserve">[5] K. Egashira et al., “Exploiting LLM quantization,” in Proc. NeurIPS, 2024. arXiv:2405.18137.</w:t>
+        <w:t xml:space="preserve">[5] K. Egashira et al., “Exploiting LLM quantization,” arXiv preprint arXiv:2405.18137, 2024.</w:t>
       </w:r>
     </w:p>
     <w:p>
@@ -6978,7 +6978,7 @@
           <w:sz w:val="22"/>
           <w:szCs w:val="22"/>
         </w:rPr>
-        <w:t xml:space="preserve">[14] I. Proskurina, L. Brun, G. Metzler, and J. Velcin, “When quantization affects confidence of large language models?,” in Findings of NAACL, 2024. arXiv:2405.00632.</w:t>
+        <w:t xml:space="preserve">[14] I. Proskurina, L. Brun, G. Metzler, and J. Velcin, “When quantization affects confidence of large language models?,” arXiv preprint arXiv:2405.00632, 2024.</w:t>
       </w:r>
     </w:p>
     <w:p>
@@ -6992,7 +6992,7 @@
           <w:sz w:val="22"/>
           <w:szCs w:val="22"/>
         </w:rPr>
-        <w:t xml:space="preserve">[15] J. Pineau et al., “Improving reproducibility in machine learning research (a report from the NeurIPS 2019 reproducibility program),” Journal of Machine Learning Research (JMLR), vol. 22, pp. 1–20, 2021.</w:t>
+        <w:t xml:space="preserve">[15] J. Pineau et al., “Improving reproducibility in machine learning research (a report from the NeurIPS 2019 reproducibility program),” Journal of Machine Learning Research (JMLR), vol. 22, 2021. arXiv:2003.12206.</w:t>
       </w:r>
     </w:p>
     <w:p>
@@ -7034,7 +7034,7 @@
           <w:sz w:val="22"/>
           <w:szCs w:val="22"/>
         </w:rPr>
-        <w:t xml:space="preserve">[18] A. M. Smith et al., “Journal of Open Source Software (JOSS): Design and first-year review,” arXiv preprint arXiv:1707.02264, 2018.</w:t>
+        <w:t xml:space="preserve">[18] A. M. Smith et al., “Journal of Open Source Software (JOSS): Design and first-year review,” arXiv preprint arXiv:1707.02264, 2017.</w:t>
       </w:r>
     </w:p>
     <w:p>

</xml_diff>